<commit_message>
docs: update AuthLock proposal document
Co-Authored-By: Claude Sonnet 5 <noreply@anthropic.com>
Claude-Session: https://claude.ai/code/session_015CUNaX7zf8VLL39EyrtvHe
</commit_message>
<xml_diff>
--- a/AuthLock_Proposal (1).docx
+++ b/AuthLock_Proposal (1).docx
@@ -45,14 +45,14 @@
         </w:tblCellMar>
       </w:tblPr>
       <w:tblGrid>
-        <w:gridCol w:w="2999"/>
-        <w:gridCol w:w="6360"/>
+        <w:gridCol w:w="2998"/>
+        <w:gridCol w:w="6361"/>
       </w:tblGrid>
       <w:tr>
         <w:trPr/>
         <w:tc>
           <w:tcPr>
-            <w:tcW w:w="2999" w:type="dxa"/>
+            <w:tcW w:w="2998" w:type="dxa"/>
             <w:tcBorders>
               <w:top w:val="single" w:sz="4" w:space="0" w:color="000000"/>
               <w:left w:val="single" w:sz="4" w:space="0" w:color="000000"/>
@@ -78,26 +78,26 @@
         </w:tc>
         <w:tc>
           <w:tcPr>
-            <w:tcW w:w="6360" w:type="dxa"/>
-            <w:tcBorders>
-              <w:top w:val="single" w:sz="4" w:space="0" w:color="000000"/>
-              <w:left w:val="single" w:sz="4" w:space="0" w:color="000000"/>
-              <w:bottom w:val="single" w:sz="4" w:space="0" w:color="000000"/>
-              <w:right w:val="single" w:sz="4" w:space="0" w:color="000000"/>
-            </w:tcBorders>
-          </w:tcPr>
-          <w:p>
-            <w:pPr>
-              <w:pStyle w:val="Normal"/>
-              <w:widowControl w:val="false"/>
-              <w:rPr/>
-            </w:pPr>
-            <w:r>
-              <w:rPr>
-                <w:b w:val="false"/>
-                <w:bCs w:val="false"/>
-              </w:rPr>
-              <w:t>Saad Ahmad</w:t>
+            <w:tcW w:w="6361" w:type="dxa"/>
+            <w:tcBorders>
+              <w:top w:val="single" w:sz="4" w:space="0" w:color="000000"/>
+              <w:left w:val="single" w:sz="4" w:space="0" w:color="000000"/>
+              <w:bottom w:val="single" w:sz="4" w:space="0" w:color="000000"/>
+              <w:right w:val="single" w:sz="4" w:space="0" w:color="000000"/>
+            </w:tcBorders>
+          </w:tcPr>
+          <w:p>
+            <w:pPr>
+              <w:pStyle w:val="Normal"/>
+              <w:widowControl w:val="false"/>
+              <w:rPr>
+                <w:b w:val="false"/>
+                <w:b w:val="false"/>
+                <w:bCs w:val="false"/>
+              </w:rPr>
+            </w:pPr>
+            <w:r>
+              <w:rPr/>
             </w:r>
           </w:p>
         </w:tc>
@@ -106,7 +106,7 @@
         <w:trPr/>
         <w:tc>
           <w:tcPr>
-            <w:tcW w:w="2999" w:type="dxa"/>
+            <w:tcW w:w="2998" w:type="dxa"/>
             <w:tcBorders>
               <w:top w:val="single" w:sz="4" w:space="0" w:color="000000"/>
               <w:left w:val="single" w:sz="4" w:space="0" w:color="000000"/>
@@ -132,26 +132,26 @@
         </w:tc>
         <w:tc>
           <w:tcPr>
-            <w:tcW w:w="6360" w:type="dxa"/>
-            <w:tcBorders>
-              <w:top w:val="single" w:sz="4" w:space="0" w:color="000000"/>
-              <w:left w:val="single" w:sz="4" w:space="0" w:color="000000"/>
-              <w:bottom w:val="single" w:sz="4" w:space="0" w:color="000000"/>
-              <w:right w:val="single" w:sz="4" w:space="0" w:color="000000"/>
-            </w:tcBorders>
-          </w:tcPr>
-          <w:p>
-            <w:pPr>
-              <w:pStyle w:val="Normal"/>
-              <w:widowControl w:val="false"/>
-              <w:rPr/>
-            </w:pPr>
-            <w:r>
-              <w:rPr>
-                <w:b w:val="false"/>
-                <w:bCs w:val="false"/>
-              </w:rPr>
-              <w:t>CS6006NU – Distributed, Cloud and IoT Systems</w:t>
+            <w:tcW w:w="6361" w:type="dxa"/>
+            <w:tcBorders>
+              <w:top w:val="single" w:sz="4" w:space="0" w:color="000000"/>
+              <w:left w:val="single" w:sz="4" w:space="0" w:color="000000"/>
+              <w:bottom w:val="single" w:sz="4" w:space="0" w:color="000000"/>
+              <w:right w:val="single" w:sz="4" w:space="0" w:color="000000"/>
+            </w:tcBorders>
+          </w:tcPr>
+          <w:p>
+            <w:pPr>
+              <w:pStyle w:val="Normal"/>
+              <w:widowControl w:val="false"/>
+              <w:rPr>
+                <w:b w:val="false"/>
+                <w:b w:val="false"/>
+                <w:bCs w:val="false"/>
+              </w:rPr>
+            </w:pPr>
+            <w:r>
+              <w:rPr/>
             </w:r>
           </w:p>
         </w:tc>
@@ -160,7 +160,7 @@
         <w:trPr/>
         <w:tc>
           <w:tcPr>
-            <w:tcW w:w="2999" w:type="dxa"/>
+            <w:tcW w:w="2998" w:type="dxa"/>
             <w:tcBorders>
               <w:top w:val="single" w:sz="4" w:space="0" w:color="000000"/>
               <w:left w:val="single" w:sz="4" w:space="0" w:color="000000"/>
@@ -186,26 +186,26 @@
         </w:tc>
         <w:tc>
           <w:tcPr>
-            <w:tcW w:w="6360" w:type="dxa"/>
-            <w:tcBorders>
-              <w:top w:val="single" w:sz="4" w:space="0" w:color="000000"/>
-              <w:left w:val="single" w:sz="4" w:space="0" w:color="000000"/>
-              <w:bottom w:val="single" w:sz="4" w:space="0" w:color="000000"/>
-              <w:right w:val="single" w:sz="4" w:space="0" w:color="000000"/>
-            </w:tcBorders>
-          </w:tcPr>
-          <w:p>
-            <w:pPr>
-              <w:pStyle w:val="Normal"/>
-              <w:widowControl w:val="false"/>
-              <w:rPr/>
-            </w:pPr>
-            <w:r>
-              <w:rPr>
-                <w:b w:val="false"/>
-                <w:bCs w:val="false"/>
-              </w:rPr>
-              <w:t>sayedsaadahmad254@gmail.com</w:t>
+            <w:tcW w:w="6361" w:type="dxa"/>
+            <w:tcBorders>
+              <w:top w:val="single" w:sz="4" w:space="0" w:color="000000"/>
+              <w:left w:val="single" w:sz="4" w:space="0" w:color="000000"/>
+              <w:bottom w:val="single" w:sz="4" w:space="0" w:color="000000"/>
+              <w:right w:val="single" w:sz="4" w:space="0" w:color="000000"/>
+            </w:tcBorders>
+          </w:tcPr>
+          <w:p>
+            <w:pPr>
+              <w:pStyle w:val="Normal"/>
+              <w:widowControl w:val="false"/>
+              <w:rPr>
+                <w:b w:val="false"/>
+                <w:b w:val="false"/>
+                <w:bCs w:val="false"/>
+              </w:rPr>
+            </w:pPr>
+            <w:r>
+              <w:rPr/>
             </w:r>
           </w:p>
         </w:tc>
@@ -214,7 +214,7 @@
         <w:trPr/>
         <w:tc>
           <w:tcPr>
-            <w:tcW w:w="2999" w:type="dxa"/>
+            <w:tcW w:w="2998" w:type="dxa"/>
             <w:tcBorders>
               <w:top w:val="single" w:sz="4" w:space="0" w:color="000000"/>
               <w:left w:val="single" w:sz="4" w:space="0" w:color="000000"/>
@@ -240,26 +240,26 @@
         </w:tc>
         <w:tc>
           <w:tcPr>
-            <w:tcW w:w="6360" w:type="dxa"/>
-            <w:tcBorders>
-              <w:top w:val="single" w:sz="4" w:space="0" w:color="000000"/>
-              <w:left w:val="single" w:sz="4" w:space="0" w:color="000000"/>
-              <w:bottom w:val="single" w:sz="4" w:space="0" w:color="000000"/>
-              <w:right w:val="single" w:sz="4" w:space="0" w:color="000000"/>
-            </w:tcBorders>
-          </w:tcPr>
-          <w:p>
-            <w:pPr>
-              <w:pStyle w:val="Normal"/>
-              <w:widowControl w:val="false"/>
-              <w:rPr/>
-            </w:pPr>
-            <w:r>
-              <w:rPr>
-                <w:b w:val="false"/>
-                <w:bCs w:val="false"/>
-              </w:rPr>
-              <w:t>03405030768</w:t>
+            <w:tcW w:w="6361" w:type="dxa"/>
+            <w:tcBorders>
+              <w:top w:val="single" w:sz="4" w:space="0" w:color="000000"/>
+              <w:left w:val="single" w:sz="4" w:space="0" w:color="000000"/>
+              <w:bottom w:val="single" w:sz="4" w:space="0" w:color="000000"/>
+              <w:right w:val="single" w:sz="4" w:space="0" w:color="000000"/>
+            </w:tcBorders>
+          </w:tcPr>
+          <w:p>
+            <w:pPr>
+              <w:pStyle w:val="Normal"/>
+              <w:widowControl w:val="false"/>
+              <w:rPr>
+                <w:b w:val="false"/>
+                <w:b w:val="false"/>
+                <w:bCs w:val="false"/>
+              </w:rPr>
+            </w:pPr>
+            <w:r>
+              <w:rPr/>
             </w:r>
           </w:p>
         </w:tc>
@@ -268,7 +268,7 @@
         <w:trPr/>
         <w:tc>
           <w:tcPr>
-            <w:tcW w:w="2999" w:type="dxa"/>
+            <w:tcW w:w="2998" w:type="dxa"/>
             <w:tcBorders>
               <w:top w:val="single" w:sz="4" w:space="0" w:color="000000"/>
               <w:left w:val="single" w:sz="4" w:space="0" w:color="000000"/>
@@ -294,7 +294,7 @@
         </w:tc>
         <w:tc>
           <w:tcPr>
-            <w:tcW w:w="6360" w:type="dxa"/>
+            <w:tcW w:w="6361" w:type="dxa"/>
             <w:tcBorders>
               <w:top w:val="single" w:sz="4" w:space="0" w:color="000000"/>
               <w:left w:val="single" w:sz="4" w:space="0" w:color="000000"/>
@@ -380,7 +380,7 @@
         <w:pStyle w:val="ListParagraph"/>
         <w:numPr>
           <w:ilvl w:val="0"/>
-          <w:numId w:val="3"/>
+          <w:numId w:val="4"/>
         </w:numPr>
         <w:spacing w:before="0" w:after="80"/>
         <w:rPr/>
@@ -395,7 +395,7 @@
         <w:pStyle w:val="ListParagraph"/>
         <w:numPr>
           <w:ilvl w:val="0"/>
-          <w:numId w:val="1"/>
+          <w:numId w:val="5"/>
         </w:numPr>
         <w:spacing w:before="0" w:after="80"/>
         <w:rPr/>
@@ -410,7 +410,7 @@
         <w:pStyle w:val="ListParagraph"/>
         <w:numPr>
           <w:ilvl w:val="0"/>
-          <w:numId w:val="1"/>
+          <w:numId w:val="6"/>
         </w:numPr>
         <w:spacing w:before="0" w:after="80"/>
         <w:rPr/>
@@ -425,7 +425,7 @@
         <w:pStyle w:val="ListParagraph"/>
         <w:numPr>
           <w:ilvl w:val="0"/>
-          <w:numId w:val="1"/>
+          <w:numId w:val="7"/>
         </w:numPr>
         <w:spacing w:before="0" w:after="80"/>
         <w:rPr/>
@@ -463,7 +463,7 @@
         <w:pStyle w:val="ListParagraph"/>
         <w:numPr>
           <w:ilvl w:val="0"/>
-          <w:numId w:val="1"/>
+          <w:numId w:val="8"/>
         </w:numPr>
         <w:spacing w:before="0" w:after="80"/>
         <w:rPr/>
@@ -478,7 +478,7 @@
         <w:pStyle w:val="ListParagraph"/>
         <w:numPr>
           <w:ilvl w:val="0"/>
-          <w:numId w:val="1"/>
+          <w:numId w:val="9"/>
         </w:numPr>
         <w:spacing w:before="0" w:after="80"/>
         <w:rPr/>
@@ -493,7 +493,7 @@
         <w:pStyle w:val="ListParagraph"/>
         <w:numPr>
           <w:ilvl w:val="0"/>
-          <w:numId w:val="1"/>
+          <w:numId w:val="10"/>
         </w:numPr>
         <w:spacing w:before="0" w:after="80"/>
         <w:rPr/>
@@ -508,7 +508,7 @@
         <w:pStyle w:val="ListParagraph"/>
         <w:numPr>
           <w:ilvl w:val="0"/>
-          <w:numId w:val="1"/>
+          <w:numId w:val="11"/>
         </w:numPr>
         <w:spacing w:before="0" w:after="80"/>
         <w:rPr/>
@@ -523,7 +523,7 @@
         <w:pStyle w:val="ListParagraph"/>
         <w:numPr>
           <w:ilvl w:val="0"/>
-          <w:numId w:val="1"/>
+          <w:numId w:val="12"/>
         </w:numPr>
         <w:spacing w:before="0" w:after="80"/>
         <w:rPr/>
@@ -572,7 +572,7 @@
         <w:pStyle w:val="ListParagraph"/>
         <w:numPr>
           <w:ilvl w:val="0"/>
-          <w:numId w:val="1"/>
+          <w:numId w:val="13"/>
         </w:numPr>
         <w:spacing w:before="0" w:after="80"/>
         <w:rPr/>
@@ -587,7 +587,7 @@
         <w:pStyle w:val="ListParagraph"/>
         <w:numPr>
           <w:ilvl w:val="0"/>
-          <w:numId w:val="1"/>
+          <w:numId w:val="14"/>
         </w:numPr>
         <w:spacing w:before="0" w:after="80"/>
         <w:rPr/>
@@ -602,7 +602,7 @@
         <w:pStyle w:val="ListParagraph"/>
         <w:numPr>
           <w:ilvl w:val="0"/>
-          <w:numId w:val="1"/>
+          <w:numId w:val="15"/>
         </w:numPr>
         <w:spacing w:before="0" w:after="80"/>
         <w:rPr/>
@@ -617,7 +617,7 @@
         <w:pStyle w:val="ListParagraph"/>
         <w:numPr>
           <w:ilvl w:val="0"/>
-          <w:numId w:val="1"/>
+          <w:numId w:val="16"/>
         </w:numPr>
         <w:spacing w:before="0" w:after="80"/>
         <w:rPr/>
@@ -632,7 +632,7 @@
         <w:pStyle w:val="ListParagraph"/>
         <w:numPr>
           <w:ilvl w:val="0"/>
-          <w:numId w:val="1"/>
+          <w:numId w:val="17"/>
         </w:numPr>
         <w:spacing w:before="0" w:after="80"/>
         <w:rPr/>
@@ -1604,7 +1604,7 @@
         <w:pStyle w:val="ListParagraph"/>
         <w:numPr>
           <w:ilvl w:val="0"/>
-          <w:numId w:val="1"/>
+          <w:numId w:val="18"/>
         </w:numPr>
         <w:spacing w:before="0" w:after="80"/>
         <w:rPr/>
@@ -1619,7 +1619,7 @@
         <w:pStyle w:val="ListParagraph"/>
         <w:numPr>
           <w:ilvl w:val="0"/>
-          <w:numId w:val="1"/>
+          <w:numId w:val="19"/>
         </w:numPr>
         <w:spacing w:before="0" w:after="80"/>
         <w:rPr/>
@@ -1634,7 +1634,7 @@
         <w:pStyle w:val="ListParagraph"/>
         <w:numPr>
           <w:ilvl w:val="0"/>
-          <w:numId w:val="1"/>
+          <w:numId w:val="20"/>
         </w:numPr>
         <w:spacing w:before="0" w:after="80"/>
         <w:rPr/>
@@ -1649,7 +1649,7 @@
         <w:pStyle w:val="ListParagraph"/>
         <w:numPr>
           <w:ilvl w:val="0"/>
-          <w:numId w:val="1"/>
+          <w:numId w:val="21"/>
         </w:numPr>
         <w:spacing w:before="0" w:after="80"/>
         <w:rPr/>
@@ -1664,7 +1664,7 @@
         <w:pStyle w:val="ListParagraph"/>
         <w:numPr>
           <w:ilvl w:val="0"/>
-          <w:numId w:val="1"/>
+          <w:numId w:val="22"/>
         </w:numPr>
         <w:spacing w:before="0" w:after="80"/>
         <w:rPr/>
@@ -1679,7 +1679,7 @@
         <w:pStyle w:val="ListParagraph"/>
         <w:numPr>
           <w:ilvl w:val="0"/>
-          <w:numId w:val="1"/>
+          <w:numId w:val="23"/>
         </w:numPr>
         <w:spacing w:before="0" w:after="80"/>
         <w:rPr/>
@@ -1740,7 +1740,7 @@
         <w:pStyle w:val="ListParagraph"/>
         <w:numPr>
           <w:ilvl w:val="0"/>
-          <w:numId w:val="1"/>
+          <w:numId w:val="24"/>
         </w:numPr>
         <w:spacing w:before="0" w:after="80"/>
         <w:rPr/>
@@ -1755,7 +1755,7 @@
         <w:pStyle w:val="ListParagraph"/>
         <w:numPr>
           <w:ilvl w:val="0"/>
-          <w:numId w:val="1"/>
+          <w:numId w:val="25"/>
         </w:numPr>
         <w:spacing w:before="0" w:after="80"/>
         <w:rPr/>
@@ -1770,7 +1770,7 @@
         <w:pStyle w:val="ListParagraph"/>
         <w:numPr>
           <w:ilvl w:val="0"/>
-          <w:numId w:val="1"/>
+          <w:numId w:val="26"/>
         </w:numPr>
         <w:spacing w:before="0" w:after="80"/>
         <w:rPr/>
@@ -1785,7 +1785,7 @@
         <w:pStyle w:val="ListParagraph"/>
         <w:numPr>
           <w:ilvl w:val="0"/>
-          <w:numId w:val="1"/>
+          <w:numId w:val="27"/>
         </w:numPr>
         <w:spacing w:before="0" w:after="80"/>
         <w:rPr/>
@@ -1800,7 +1800,7 @@
         <w:pStyle w:val="ListParagraph"/>
         <w:numPr>
           <w:ilvl w:val="0"/>
-          <w:numId w:val="1"/>
+          <w:numId w:val="28"/>
         </w:numPr>
         <w:spacing w:before="0" w:after="80"/>
         <w:rPr/>
@@ -1875,6 +1875,7 @@
         </w:tabs>
         <w:ind w:left="1080" w:hanging="360"/>
       </w:pPr>
+      <w:rPr/>
     </w:lvl>
     <w:lvl w:ilvl="2">
       <w:start w:val="1"/>
@@ -1887,6 +1888,7 @@
         </w:tabs>
         <w:ind w:left="1440" w:hanging="360"/>
       </w:pPr>
+      <w:rPr/>
     </w:lvl>
     <w:lvl w:ilvl="3">
       <w:start w:val="1"/>
@@ -1899,6 +1901,7 @@
         </w:tabs>
         <w:ind w:left="1800" w:hanging="360"/>
       </w:pPr>
+      <w:rPr/>
     </w:lvl>
     <w:lvl w:ilvl="4">
       <w:start w:val="1"/>
@@ -1911,6 +1914,7 @@
         </w:tabs>
         <w:ind w:left="2160" w:hanging="360"/>
       </w:pPr>
+      <w:rPr/>
     </w:lvl>
     <w:lvl w:ilvl="5">
       <w:start w:val="1"/>
@@ -1923,6 +1927,7 @@
         </w:tabs>
         <w:ind w:left="2520" w:hanging="360"/>
       </w:pPr>
+      <w:rPr/>
     </w:lvl>
     <w:lvl w:ilvl="6">
       <w:start w:val="1"/>
@@ -1935,6 +1940,7 @@
         </w:tabs>
         <w:ind w:left="2880" w:hanging="360"/>
       </w:pPr>
+      <w:rPr/>
     </w:lvl>
     <w:lvl w:ilvl="7">
       <w:start w:val="1"/>
@@ -1947,6 +1953,7 @@
         </w:tabs>
         <w:ind w:left="3240" w:hanging="360"/>
       </w:pPr>
+      <w:rPr/>
     </w:lvl>
     <w:lvl w:ilvl="8">
       <w:start w:val="1"/>
@@ -1959,9 +1966,131 @@
         </w:tabs>
         <w:ind w:left="3600" w:hanging="360"/>
       </w:pPr>
+      <w:rPr/>
     </w:lvl>
   </w:abstractNum>
   <w:abstractNum w:abstractNumId="2">
+    <w:lvl w:ilvl="0">
+      <w:start w:val="1"/>
+      <w:numFmt w:val="bullet"/>
+      <w:lvlText w:val=""/>
+      <w:lvlJc w:val="left"/>
+      <w:pPr>
+        <w:tabs>
+          <w:tab w:val="num" w:pos="0"/>
+        </w:tabs>
+        <w:ind w:left="420" w:hanging="260"/>
+      </w:pPr>
+      <w:rPr>
+        <w:rFonts w:ascii="Symbol" w:hAnsi="Symbol" w:cs="Symbol" w:hint="default"/>
+      </w:rPr>
+    </w:lvl>
+    <w:lvl w:ilvl="1">
+      <w:start w:val="1"/>
+      <w:numFmt w:val="decimal"/>
+      <w:lvlText w:val="%2."/>
+      <w:lvlJc w:val="left"/>
+      <w:pPr>
+        <w:tabs>
+          <w:tab w:val="num" w:pos="1080"/>
+        </w:tabs>
+        <w:ind w:left="1080" w:hanging="360"/>
+      </w:pPr>
+      <w:rPr/>
+    </w:lvl>
+    <w:lvl w:ilvl="2">
+      <w:start w:val="1"/>
+      <w:numFmt w:val="decimal"/>
+      <w:lvlText w:val="%3."/>
+      <w:lvlJc w:val="left"/>
+      <w:pPr>
+        <w:tabs>
+          <w:tab w:val="num" w:pos="1440"/>
+        </w:tabs>
+        <w:ind w:left="1440" w:hanging="360"/>
+      </w:pPr>
+      <w:rPr/>
+    </w:lvl>
+    <w:lvl w:ilvl="3">
+      <w:start w:val="1"/>
+      <w:numFmt w:val="decimal"/>
+      <w:lvlText w:val="%4."/>
+      <w:lvlJc w:val="left"/>
+      <w:pPr>
+        <w:tabs>
+          <w:tab w:val="num" w:pos="1800"/>
+        </w:tabs>
+        <w:ind w:left="1800" w:hanging="360"/>
+      </w:pPr>
+      <w:rPr/>
+    </w:lvl>
+    <w:lvl w:ilvl="4">
+      <w:start w:val="1"/>
+      <w:numFmt w:val="decimal"/>
+      <w:lvlText w:val="%5."/>
+      <w:lvlJc w:val="left"/>
+      <w:pPr>
+        <w:tabs>
+          <w:tab w:val="num" w:pos="2160"/>
+        </w:tabs>
+        <w:ind w:left="2160" w:hanging="360"/>
+      </w:pPr>
+      <w:rPr/>
+    </w:lvl>
+    <w:lvl w:ilvl="5">
+      <w:start w:val="1"/>
+      <w:numFmt w:val="decimal"/>
+      <w:lvlText w:val="%6."/>
+      <w:lvlJc w:val="left"/>
+      <w:pPr>
+        <w:tabs>
+          <w:tab w:val="num" w:pos="2520"/>
+        </w:tabs>
+        <w:ind w:left="2520" w:hanging="360"/>
+      </w:pPr>
+      <w:rPr/>
+    </w:lvl>
+    <w:lvl w:ilvl="6">
+      <w:start w:val="1"/>
+      <w:numFmt w:val="decimal"/>
+      <w:lvlText w:val="%7."/>
+      <w:lvlJc w:val="left"/>
+      <w:pPr>
+        <w:tabs>
+          <w:tab w:val="num" w:pos="2880"/>
+        </w:tabs>
+        <w:ind w:left="2880" w:hanging="360"/>
+      </w:pPr>
+      <w:rPr/>
+    </w:lvl>
+    <w:lvl w:ilvl="7">
+      <w:start w:val="1"/>
+      <w:numFmt w:val="decimal"/>
+      <w:lvlText w:val="%8."/>
+      <w:lvlJc w:val="left"/>
+      <w:pPr>
+        <w:tabs>
+          <w:tab w:val="num" w:pos="3240"/>
+        </w:tabs>
+        <w:ind w:left="3240" w:hanging="360"/>
+      </w:pPr>
+      <w:rPr/>
+    </w:lvl>
+    <w:lvl w:ilvl="8">
+      <w:start w:val="1"/>
+      <w:numFmt w:val="decimal"/>
+      <w:lvlText w:val="%9."/>
+      <w:lvlJc w:val="left"/>
+      <w:pPr>
+        <w:tabs>
+          <w:tab w:val="num" w:pos="3600"/>
+        </w:tabs>
+        <w:ind w:left="3600" w:hanging="360"/>
+      </w:pPr>
+      <w:rPr/>
+    </w:lvl>
+  </w:abstractNum>
+  <w:abstractNum w:abstractNumId="3">
     <w:lvl w:ilvl="0">
       <w:start w:val="1"/>
       <w:numFmt w:val="none"/>
@@ -2087,10 +2216,85 @@
     <w:abstractNumId w:val="2"/>
   </w:num>
   <w:num w:numId="3">
-    <w:abstractNumId w:val="1"/>
+    <w:abstractNumId w:val="3"/>
+  </w:num>
+  <w:num w:numId="4">
+    <w:abstractNumId w:val="2"/>
     <w:lvlOverride w:ilvl="0">
       <w:startOverride w:val="1"/>
     </w:lvlOverride>
+  </w:num>
+  <w:num w:numId="5">
+    <w:abstractNumId w:val="2"/>
+  </w:num>
+  <w:num w:numId="6">
+    <w:abstractNumId w:val="2"/>
+  </w:num>
+  <w:num w:numId="7">
+    <w:abstractNumId w:val="2"/>
+  </w:num>
+  <w:num w:numId="8">
+    <w:abstractNumId w:val="2"/>
+  </w:num>
+  <w:num w:numId="9">
+    <w:abstractNumId w:val="2"/>
+  </w:num>
+  <w:num w:numId="10">
+    <w:abstractNumId w:val="2"/>
+  </w:num>
+  <w:num w:numId="11">
+    <w:abstractNumId w:val="2"/>
+  </w:num>
+  <w:num w:numId="12">
+    <w:abstractNumId w:val="2"/>
+  </w:num>
+  <w:num w:numId="13">
+    <w:abstractNumId w:val="2"/>
+  </w:num>
+  <w:num w:numId="14">
+    <w:abstractNumId w:val="2"/>
+  </w:num>
+  <w:num w:numId="15">
+    <w:abstractNumId w:val="2"/>
+  </w:num>
+  <w:num w:numId="16">
+    <w:abstractNumId w:val="2"/>
+  </w:num>
+  <w:num w:numId="17">
+    <w:abstractNumId w:val="2"/>
+  </w:num>
+  <w:num w:numId="18">
+    <w:abstractNumId w:val="2"/>
+  </w:num>
+  <w:num w:numId="19">
+    <w:abstractNumId w:val="2"/>
+  </w:num>
+  <w:num w:numId="20">
+    <w:abstractNumId w:val="2"/>
+  </w:num>
+  <w:num w:numId="21">
+    <w:abstractNumId w:val="2"/>
+  </w:num>
+  <w:num w:numId="22">
+    <w:abstractNumId w:val="2"/>
+  </w:num>
+  <w:num w:numId="23">
+    <w:abstractNumId w:val="2"/>
+  </w:num>
+  <w:num w:numId="24">
+    <w:abstractNumId w:val="2"/>
+  </w:num>
+  <w:num w:numId="25">
+    <w:abstractNumId w:val="2"/>
+  </w:num>
+  <w:num w:numId="26">
+    <w:abstractNumId w:val="2"/>
+  </w:num>
+  <w:num w:numId="27">
+    <w:abstractNumId w:val="2"/>
+  </w:num>
+  <w:num w:numId="28">
+    <w:abstractNumId w:val="2"/>
   </w:num>
 </w:numbering>
 </file>
@@ -2115,6 +2319,7 @@
     <w:qFormat/>
     <w:pPr>
       <w:widowControl/>
+      <w:suppressAutoHyphens w:val="true"/>
       <w:bidi w:val="0"/>
       <w:spacing w:before="0" w:after="0"/>
       <w:jc w:val="left"/>
@@ -2328,6 +2533,7 @@
     <w:qFormat/>
     <w:pPr>
       <w:widowControl/>
+      <w:suppressAutoHyphens w:val="true"/>
       <w:bidi w:val="0"/>
       <w:spacing w:before="0" w:after="0"/>
       <w:jc w:val="left"/>
@@ -2348,6 +2554,7 @@
     <w:qFormat/>
     <w:pPr>
       <w:widowControl/>
+      <w:suppressAutoHyphens w:val="true"/>
       <w:bidi w:val="0"/>
       <w:spacing w:before="0" w:after="0"/>
       <w:jc w:val="left"/>

</xml_diff>